<commit_message>
docs: final paper and README complete
</commit_message>
<xml_diff>
--- a/paper/AuthentiScan_Paper.docx
+++ b/paper/AuthentiScan_Paper.docx
@@ -520,14 +520,7 @@
           <w:b/>
           <w:bCs/>
         </w:rPr>
-        <w:t>IV.</w:t>
-      </w:r>
-      <w:r>
-        <w:rPr>
-          <w:b/>
-          <w:bCs/>
-        </w:rPr>
-        <w:t xml:space="preserve"> DATASET CONSTRUCTION</w:t>
+        <w:t>IV. DATASET CONSTRUCTION</w:t>
       </w:r>
     </w:p>
     <w:p>
@@ -638,12 +631,6 @@
         <w:gridCol w:w="1332"/>
       </w:tblGrid>
       <w:tr>
-        <w:tblPrEx>
-          <w:tblCellMar>
-            <w:top w:w="0" w:type="dxa"/>
-            <w:bottom w:w="0" w:type="dxa"/>
-          </w:tblCellMar>
-        </w:tblPrEx>
         <w:trPr>
           <w:tblHeader/>
         </w:trPr>
@@ -748,12 +735,6 @@
         </w:tc>
       </w:tr>
       <w:tr>
-        <w:tblPrEx>
-          <w:tblCellMar>
-            <w:top w:w="0" w:type="dxa"/>
-            <w:bottom w:w="0" w:type="dxa"/>
-          </w:tblCellMar>
-        </w:tblPrEx>
         <w:tc>
           <w:tcPr>
             <w:tcW w:w="1664" w:type="dxa"/>
@@ -846,12 +827,6 @@
         </w:tc>
       </w:tr>
       <w:tr>
-        <w:tblPrEx>
-          <w:tblCellMar>
-            <w:top w:w="0" w:type="dxa"/>
-            <w:bottom w:w="0" w:type="dxa"/>
-          </w:tblCellMar>
-        </w:tblPrEx>
         <w:tc>
           <w:tcPr>
             <w:tcW w:w="1664" w:type="dxa"/>
@@ -944,12 +919,6 @@
         </w:tc>
       </w:tr>
       <w:tr>
-        <w:tblPrEx>
-          <w:tblCellMar>
-            <w:top w:w="0" w:type="dxa"/>
-            <w:bottom w:w="0" w:type="dxa"/>
-          </w:tblCellMar>
-        </w:tblPrEx>
         <w:tc>
           <w:tcPr>
             <w:tcW w:w="1664" w:type="dxa"/>
@@ -1042,12 +1011,6 @@
         </w:tc>
       </w:tr>
       <w:tr>
-        <w:tblPrEx>
-          <w:tblCellMar>
-            <w:top w:w="0" w:type="dxa"/>
-            <w:bottom w:w="0" w:type="dxa"/>
-          </w:tblCellMar>
-        </w:tblPrEx>
         <w:tc>
           <w:tcPr>
             <w:tcW w:w="1664" w:type="dxa"/>
@@ -1140,12 +1103,6 @@
         </w:tc>
       </w:tr>
       <w:tr>
-        <w:tblPrEx>
-          <w:tblCellMar>
-            <w:top w:w="0" w:type="dxa"/>
-            <w:bottom w:w="0" w:type="dxa"/>
-          </w:tblCellMar>
-        </w:tblPrEx>
         <w:tc>
           <w:tcPr>
             <w:tcW w:w="1664" w:type="dxa"/>
@@ -1302,11 +1259,13 @@
     <w:p>
       <w:pPr>
         <w:sectPr>
-          <w:footerReference w:type="default" r:id="rId8"/>
+          <w:headerReference w:type="default" r:id="rId8"/>
+          <w:footerReference w:type="default" r:id="rId9"/>
           <w:type w:val="continuous"/>
           <w:pgSz w:w="11906" w:h="16838"/>
           <w:pgMar w:top="1080" w:right="860" w:bottom="1080" w:left="860" w:header="708" w:footer="708" w:gutter="0"/>
           <w:cols w:num="2" w:space="440"/>
+          <w:titlePg/>
           <w:docGrid w:linePitch="360"/>
         </w:sectPr>
       </w:pPr>
@@ -1338,7 +1297,7 @@
                     </pic:cNvPicPr>
                   </pic:nvPicPr>
                   <pic:blipFill>
-                    <a:blip r:embed="rId9"/>
+                    <a:blip r:embed="rId10"/>
                     <a:srcRect/>
                     <a:stretch>
                       <a:fillRect/>
@@ -1398,7 +1357,7 @@
     <w:p>
       <w:pPr>
         <w:sectPr>
-          <w:footerReference w:type="default" r:id="rId10"/>
+          <w:footerReference w:type="default" r:id="rId11"/>
           <w:type w:val="continuous"/>
           <w:pgSz w:w="11906" w:h="16838"/>
           <w:pgMar w:top="1080" w:right="860" w:bottom="1080" w:left="860" w:header="708" w:footer="708" w:gutter="0"/>
@@ -1416,14 +1375,7 @@
           <w:b/>
           <w:bCs/>
         </w:rPr>
-        <w:t>V.</w:t>
-      </w:r>
-      <w:r>
-        <w:rPr>
-          <w:b/>
-          <w:bCs/>
-        </w:rPr>
-        <w:t xml:space="preserve"> METHODOLOGY</w:t>
+        <w:t>V. METHODOLOGY</w:t>
       </w:r>
     </w:p>
     <w:p>
@@ -1589,14 +1541,7 @@
           <w:b/>
           <w:bCs/>
         </w:rPr>
-        <w:t>VI.</w:t>
-      </w:r>
-      <w:r>
-        <w:rPr>
-          <w:b/>
-          <w:bCs/>
-        </w:rPr>
-        <w:t xml:space="preserve"> EXPERIMENTS AND RESULTS</w:t>
+        <w:t>VI. EXPERIMENTS AND RESULTS</w:t>
       </w:r>
     </w:p>
     <w:p>
@@ -1666,12 +1611,6 @@
         <w:gridCol w:w="1248"/>
       </w:tblGrid>
       <w:tr>
-        <w:tblPrEx>
-          <w:tblCellMar>
-            <w:top w:w="0" w:type="dxa"/>
-            <w:bottom w:w="0" w:type="dxa"/>
-          </w:tblCellMar>
-        </w:tblPrEx>
         <w:trPr>
           <w:tblHeader/>
         </w:trPr>
@@ -1776,12 +1715,6 @@
         </w:tc>
       </w:tr>
       <w:tr>
-        <w:tblPrEx>
-          <w:tblCellMar>
-            <w:top w:w="0" w:type="dxa"/>
-            <w:bottom w:w="0" w:type="dxa"/>
-          </w:tblCellMar>
-        </w:tblPrEx>
         <w:tc>
           <w:tcPr>
             <w:tcW w:w="2496" w:type="dxa"/>
@@ -1874,12 +1807,6 @@
         </w:tc>
       </w:tr>
       <w:tr>
-        <w:tblPrEx>
-          <w:tblCellMar>
-            <w:top w:w="0" w:type="dxa"/>
-            <w:bottom w:w="0" w:type="dxa"/>
-          </w:tblCellMar>
-        </w:tblPrEx>
         <w:tc>
           <w:tcPr>
             <w:tcW w:w="2496" w:type="dxa"/>
@@ -1972,12 +1899,6 @@
         </w:tc>
       </w:tr>
       <w:tr>
-        <w:tblPrEx>
-          <w:tblCellMar>
-            <w:top w:w="0" w:type="dxa"/>
-            <w:bottom w:w="0" w:type="dxa"/>
-          </w:tblCellMar>
-        </w:tblPrEx>
         <w:tc>
           <w:tcPr>
             <w:tcW w:w="2496" w:type="dxa"/>
@@ -2070,12 +1991,6 @@
         </w:tc>
       </w:tr>
       <w:tr>
-        <w:tblPrEx>
-          <w:tblCellMar>
-            <w:top w:w="0" w:type="dxa"/>
-            <w:bottom w:w="0" w:type="dxa"/>
-          </w:tblCellMar>
-        </w:tblPrEx>
         <w:tc>
           <w:tcPr>
             <w:tcW w:w="2496" w:type="dxa"/>
@@ -2243,12 +2158,6 @@
         <w:gridCol w:w="2244"/>
       </w:tblGrid>
       <w:tr>
-        <w:tblPrEx>
-          <w:tblCellMar>
-            <w:top w:w="0" w:type="dxa"/>
-            <w:bottom w:w="0" w:type="dxa"/>
-          </w:tblCellMar>
-        </w:tblPrEx>
         <w:trPr>
           <w:tblHeader/>
         </w:trPr>
@@ -2353,12 +2262,6 @@
         </w:tc>
       </w:tr>
       <w:tr>
-        <w:tblPrEx>
-          <w:tblCellMar>
-            <w:top w:w="0" w:type="dxa"/>
-            <w:bottom w:w="0" w:type="dxa"/>
-          </w:tblCellMar>
-        </w:tblPrEx>
         <w:tc>
           <w:tcPr>
             <w:tcW w:w="1248" w:type="dxa"/>
@@ -2451,12 +2354,6 @@
         </w:tc>
       </w:tr>
       <w:tr>
-        <w:tblPrEx>
-          <w:tblCellMar>
-            <w:top w:w="0" w:type="dxa"/>
-            <w:bottom w:w="0" w:type="dxa"/>
-          </w:tblCellMar>
-        </w:tblPrEx>
         <w:tc>
           <w:tcPr>
             <w:tcW w:w="1248" w:type="dxa"/>
@@ -2549,12 +2446,6 @@
         </w:tc>
       </w:tr>
       <w:tr>
-        <w:tblPrEx>
-          <w:tblCellMar>
-            <w:top w:w="0" w:type="dxa"/>
-            <w:bottom w:w="0" w:type="dxa"/>
-          </w:tblCellMar>
-        </w:tblPrEx>
         <w:tc>
           <w:tcPr>
             <w:tcW w:w="1248" w:type="dxa"/>
@@ -2671,7 +2562,7 @@
     <w:p>
       <w:pPr>
         <w:sectPr>
-          <w:footerReference w:type="default" r:id="rId11"/>
+          <w:footerReference w:type="default" r:id="rId12"/>
           <w:type w:val="continuous"/>
           <w:pgSz w:w="11906" w:h="16838"/>
           <w:pgMar w:top="1080" w:right="860" w:bottom="1080" w:left="860" w:header="708" w:footer="708" w:gutter="0"/>
@@ -2707,7 +2598,7 @@
                     </pic:cNvPicPr>
                   </pic:nvPicPr>
                   <pic:blipFill>
-                    <a:blip r:embed="rId12"/>
+                    <a:blip r:embed="rId13"/>
                     <a:srcRect/>
                     <a:stretch>
                       <a:fillRect/>
@@ -2767,7 +2658,7 @@
     <w:p>
       <w:pPr>
         <w:sectPr>
-          <w:footerReference w:type="default" r:id="rId13"/>
+          <w:footerReference w:type="default" r:id="rId14"/>
           <w:type w:val="continuous"/>
           <w:pgSz w:w="11906" w:h="16838"/>
           <w:pgMar w:top="1080" w:right="860" w:bottom="1080" w:left="860" w:header="708" w:footer="708" w:gutter="0"/>
@@ -2851,12 +2742,6 @@
         <w:gridCol w:w="1248"/>
       </w:tblGrid>
       <w:tr>
-        <w:tblPrEx>
-          <w:tblCellMar>
-            <w:top w:w="0" w:type="dxa"/>
-            <w:bottom w:w="0" w:type="dxa"/>
-          </w:tblCellMar>
-        </w:tblPrEx>
         <w:trPr>
           <w:tblHeader/>
         </w:trPr>
@@ -2961,12 +2846,6 @@
         </w:tc>
       </w:tr>
       <w:tr>
-        <w:tblPrEx>
-          <w:tblCellMar>
-            <w:top w:w="0" w:type="dxa"/>
-            <w:bottom w:w="0" w:type="dxa"/>
-          </w:tblCellMar>
-        </w:tblPrEx>
         <w:tc>
           <w:tcPr>
             <w:tcW w:w="2496" w:type="dxa"/>
@@ -3059,12 +2938,6 @@
         </w:tc>
       </w:tr>
       <w:tr>
-        <w:tblPrEx>
-          <w:tblCellMar>
-            <w:top w:w="0" w:type="dxa"/>
-            <w:bottom w:w="0" w:type="dxa"/>
-          </w:tblCellMar>
-        </w:tblPrEx>
         <w:tc>
           <w:tcPr>
             <w:tcW w:w="2496" w:type="dxa"/>
@@ -3157,12 +3030,6 @@
         </w:tc>
       </w:tr>
       <w:tr>
-        <w:tblPrEx>
-          <w:tblCellMar>
-            <w:top w:w="0" w:type="dxa"/>
-            <w:bottom w:w="0" w:type="dxa"/>
-          </w:tblCellMar>
-        </w:tblPrEx>
         <w:tc>
           <w:tcPr>
             <w:tcW w:w="2496" w:type="dxa"/>
@@ -3335,7 +3202,7 @@
                     </pic:cNvPicPr>
                   </pic:nvPicPr>
                   <pic:blipFill>
-                    <a:blip r:embed="rId14"/>
+                    <a:blip r:embed="rId15"/>
                     <a:srcRect/>
                     <a:stretch>
                       <a:fillRect/>
@@ -3416,12 +3283,6 @@
         <w:gridCol w:w="624"/>
       </w:tblGrid>
       <w:tr>
-        <w:tblPrEx>
-          <w:tblCellMar>
-            <w:top w:w="0" w:type="dxa"/>
-            <w:bottom w:w="0" w:type="dxa"/>
-          </w:tblCellMar>
-        </w:tblPrEx>
         <w:trPr>
           <w:tblHeader/>
         </w:trPr>
@@ -3592,12 +3453,6 @@
         </w:tc>
       </w:tr>
       <w:tr>
-        <w:tblPrEx>
-          <w:tblCellMar>
-            <w:top w:w="0" w:type="dxa"/>
-            <w:bottom w:w="0" w:type="dxa"/>
-          </w:tblCellMar>
-        </w:tblPrEx>
         <w:tc>
           <w:tcPr>
             <w:tcW w:w="1248" w:type="dxa"/>
@@ -3750,12 +3605,6 @@
         </w:tc>
       </w:tr>
       <w:tr>
-        <w:tblPrEx>
-          <w:tblCellMar>
-            <w:top w:w="0" w:type="dxa"/>
-            <w:bottom w:w="0" w:type="dxa"/>
-          </w:tblCellMar>
-        </w:tblPrEx>
         <w:tc>
           <w:tcPr>
             <w:tcW w:w="1248" w:type="dxa"/>
@@ -3908,12 +3757,6 @@
         </w:tc>
       </w:tr>
       <w:tr>
-        <w:tblPrEx>
-          <w:tblCellMar>
-            <w:top w:w="0" w:type="dxa"/>
-            <w:bottom w:w="0" w:type="dxa"/>
-          </w:tblCellMar>
-        </w:tblPrEx>
         <w:tc>
           <w:tcPr>
             <w:tcW w:w="1248" w:type="dxa"/>
@@ -4066,12 +3909,6 @@
         </w:tc>
       </w:tr>
       <w:tr>
-        <w:tblPrEx>
-          <w:tblCellMar>
-            <w:top w:w="0" w:type="dxa"/>
-            <w:bottom w:w="0" w:type="dxa"/>
-          </w:tblCellMar>
-        </w:tblPrEx>
         <w:tc>
           <w:tcPr>
             <w:tcW w:w="1248" w:type="dxa"/>
@@ -4224,12 +4061,6 @@
         </w:tc>
       </w:tr>
       <w:tr>
-        <w:tblPrEx>
-          <w:tblCellMar>
-            <w:top w:w="0" w:type="dxa"/>
-            <w:bottom w:w="0" w:type="dxa"/>
-          </w:tblCellMar>
-        </w:tblPrEx>
         <w:tc>
           <w:tcPr>
             <w:tcW w:w="1248" w:type="dxa"/>
@@ -4412,21 +4243,7 @@
           <w:b/>
           <w:bCs/>
         </w:rPr>
-        <w:t>VII</w:t>
-      </w:r>
-      <w:r>
-        <w:rPr>
-          <w:b/>
-          <w:bCs/>
-        </w:rPr>
-        <w:t>.</w:t>
-      </w:r>
-      <w:r>
-        <w:rPr>
-          <w:b/>
-          <w:bCs/>
-        </w:rPr>
-        <w:t xml:space="preserve"> DISCUSSION</w:t>
+        <w:t>VII. DISCUSSION</w:t>
       </w:r>
     </w:p>
     <w:p>
@@ -4731,10 +4548,7 @@
         <w:jc w:val="both"/>
       </w:pPr>
       <w:r>
-        <w:t>Proc. Chinese Automation Congress (CAC), IEEE, pp. 1974–1978, 2019.</w:t>
-      </w:r>
-      <w:r>
-        <w:t xml:space="preserve"> </w:t>
+        <w:t xml:space="preserve">Proc. Chinese Automation Congress (CAC), IEEE, pp. 1974–1978, 2019. </w:t>
       </w:r>
     </w:p>
     <w:p>
@@ -4777,13 +4591,7 @@
         <w:jc w:val="both"/>
       </w:pPr>
       <w:r>
-        <w:t>[1</w:t>
-      </w:r>
-      <w:r>
-        <w:t>0</w:t>
-      </w:r>
-      <w:r>
-        <w:t>] D. V. Balaraju, "</w:t>
+        <w:t>[10] D. V. Balaraju, "</w:t>
       </w:r>
       <w:proofErr w:type="spellStart"/>
       <w:r>
@@ -4854,7 +4662,7 @@
       </w:pPr>
     </w:p>
     <w:sectPr>
-      <w:footerReference w:type="default" r:id="rId15"/>
+      <w:footerReference w:type="default" r:id="rId16"/>
       <w:type w:val="continuous"/>
       <w:pgSz w:w="11906" w:h="16838"/>
       <w:pgMar w:top="1080" w:right="860" w:bottom="1080" w:left="860" w:header="708" w:footer="708" w:gutter="0"/>
@@ -5177,6 +4985,71 @@
     </w:p>
   </w:footnote>
 </w:footnotes>
+</file>
+
+<file path=word/header1.xml><?xml version="1.0" encoding="utf-8"?>
+<w:hdr xmlns:wpc="http://schemas.microsoft.com/office/word/2010/wordprocessingCanvas" xmlns:cx="http://schemas.microsoft.com/office/drawing/2014/chartex" xmlns:cx1="http://schemas.microsoft.com/office/drawing/2015/9/8/chartex" xmlns:cx2="http://schemas.microsoft.com/office/drawing/2015/10/21/chartex" xmlns:cx3="http://schemas.microsoft.com/office/drawing/2016/5/9/chartex" xmlns:cx4="http://schemas.microsoft.com/office/drawing/2016/5/10/chartex" xmlns:cx5="http://schemas.microsoft.com/office/drawing/2016/5/11/chartex" xmlns:cx6="http://schemas.microsoft.com/office/drawing/2016/5/12/chartex" xmlns:cx7="http://schemas.microsoft.com/office/drawing/2016/5/13/chartex" xmlns:cx8="http://schemas.microsoft.com/office/drawing/2016/5/14/chartex" xmlns:mc="http://schemas.openxmlformats.org/markup-compatibility/2006" xmlns:aink="http://schemas.microsoft.com/office/drawing/2016/ink" xmlns:am3d="http://schemas.microsoft.com/office/drawing/2017/model3d" xmlns:o="urn:schemas-microsoft-com:office:office" xmlns:oel="http://schemas.microsoft.com/office/2019/extlst" xmlns:r="http://schemas.openxmlformats.org/officeDocument/2006/relationships" xmlns:m="http://schemas.openxmlformats.org/officeDocument/2006/math" xmlns:v="urn:schemas-microsoft-com:vml" xmlns:wp14="http://schemas.microsoft.com/office/word/2010/wordprocessingDrawing" xmlns:wp="http://schemas.openxmlformats.org/drawingml/2006/wordprocessingDrawing" xmlns:w10="urn:schemas-microsoft-com:office:word" xmlns:w="http://schemas.openxmlformats.org/wordprocessingml/2006/main" xmlns:w14="http://schemas.microsoft.com/office/word/2010/wordml" xmlns:w15="http://schemas.microsoft.com/office/word/2012/wordml" xmlns:w16cex="http://schemas.microsoft.com/office/word/2018/wordml/cex" xmlns:w16cid="http://schemas.microsoft.com/office/word/2016/wordml/cid" xmlns:w16="http://schemas.microsoft.com/office/word/2018/wordml" xmlns:w16du="http://schemas.microsoft.com/office/word/2023/wordml/word16du" xmlns:w16sdtdh="http://schemas.microsoft.com/office/word/2020/wordml/sdtdatahash" xmlns:w16sdtfl="http://schemas.microsoft.com/office/word/2024/wordml/sdtformatlock" xmlns:w16se="http://schemas.microsoft.com/office/word/2015/wordml/symex" xmlns:wpg="http://schemas.microsoft.com/office/word/2010/wordprocessingGroup" xmlns:wpi="http://schemas.microsoft.com/office/word/2010/wordprocessingInk" xmlns:wne="http://schemas.microsoft.com/office/word/2006/wordml" xmlns:wps="http://schemas.microsoft.com/office/word/2010/wordprocessingShape" mc:Ignorable="w14 w15 w16se w16cid w16 w16cex w16sdtdh w16sdtfl w16du wp14">
+  <w:p>
+    <w:pPr>
+      <w:pStyle w:val="Header"/>
+      <w:rPr>
+        <w:sz w:val="16"/>
+        <w:szCs w:val="16"/>
+      </w:rPr>
+    </w:pPr>
+    <w:r>
+      <w:rPr>
+        <w:sz w:val="16"/>
+        <w:szCs w:val="16"/>
+      </w:rPr>
+      <w:t>Divisha Varma Balaraju</w:t>
+    </w:r>
+    <w:r>
+      <w:rPr>
+        <w:sz w:val="16"/>
+        <w:szCs w:val="16"/>
+      </w:rPr>
+      <w:tab/>
+    </w:r>
+    <w:r>
+      <w:rPr>
+        <w:sz w:val="16"/>
+        <w:szCs w:val="16"/>
+      </w:rPr>
+      <w:tab/>
+    </w:r>
+    <w:proofErr w:type="spellStart"/>
+    <w:r>
+      <w:rPr>
+        <w:sz w:val="16"/>
+        <w:szCs w:val="16"/>
+      </w:rPr>
+      <w:t>AuthentiScan</w:t>
+    </w:r>
+    <w:proofErr w:type="spellEnd"/>
+    <w:r>
+      <w:rPr>
+        <w:sz w:val="16"/>
+        <w:szCs w:val="16"/>
+      </w:rPr>
+      <w:t>: Instagram Caption AI</w:t>
+    </w:r>
+    <w:r>
+      <w:rPr>
+        <w:sz w:val="16"/>
+        <w:szCs w:val="16"/>
+      </w:rPr>
+      <w:t xml:space="preserve"> Use</w:t>
+    </w:r>
+    <w:r>
+      <w:rPr>
+        <w:sz w:val="16"/>
+        <w:szCs w:val="16"/>
+      </w:rPr>
+      <w:t xml:space="preserve"> Detection</w:t>
+    </w:r>
+  </w:p>
+</w:hdr>
 </file>
 
 <file path=word/numbering.xml><?xml version="1.0" encoding="utf-8"?>
@@ -5902,6 +5775,48 @@
       <w:szCs w:val="20"/>
     </w:rPr>
   </w:style>
+  <w:style w:type="paragraph" w:styleId="Header">
+    <w:name w:val="header"/>
+    <w:basedOn w:val="Normal"/>
+    <w:link w:val="HeaderChar"/>
+    <w:uiPriority w:val="99"/>
+    <w:unhideWhenUsed/>
+    <w:rsid w:val="008646B9"/>
+    <w:pPr>
+      <w:tabs>
+        <w:tab w:val="center" w:pos="4513"/>
+        <w:tab w:val="right" w:pos="9026"/>
+      </w:tabs>
+    </w:pPr>
+  </w:style>
+  <w:style w:type="character" w:customStyle="1" w:styleId="HeaderChar">
+    <w:name w:val="Header Char"/>
+    <w:basedOn w:val="DefaultParagraphFont"/>
+    <w:link w:val="Header"/>
+    <w:uiPriority w:val="99"/>
+    <w:rsid w:val="008646B9"/>
+  </w:style>
+  <w:style w:type="paragraph" w:styleId="Footer">
+    <w:name w:val="footer"/>
+    <w:basedOn w:val="Normal"/>
+    <w:link w:val="FooterChar"/>
+    <w:uiPriority w:val="99"/>
+    <w:unhideWhenUsed/>
+    <w:rsid w:val="008646B9"/>
+    <w:pPr>
+      <w:tabs>
+        <w:tab w:val="center" w:pos="4513"/>
+        <w:tab w:val="right" w:pos="9026"/>
+      </w:tabs>
+    </w:pPr>
+  </w:style>
+  <w:style w:type="character" w:customStyle="1" w:styleId="FooterChar">
+    <w:name w:val="Footer Char"/>
+    <w:basedOn w:val="DefaultParagraphFont"/>
+    <w:link w:val="Footer"/>
+    <w:uiPriority w:val="99"/>
+    <w:rsid w:val="008646B9"/>
+  </w:style>
 </w:styles>
 </file>
 

</xml_diff>